<commit_message>
Add nội dụng bài làm HW02
</commit_message>
<xml_diff>
--- a/W03/[AI-03] - FIT@HCMUS - AI Disclosure Form_En.docx
+++ b/W03/[AI-03] - FIT@HCMUS - AI Disclosure Form_En.docx
@@ -229,6 +229,9 @@
             <w:r>
               <w:t>HW0</w:t>
             </w:r>
+            <w:r>
+              <w:t>2</w:t>
+            </w:r>
           </w:p>
         </w:tc>
       </w:tr>
@@ -259,6 +262,9 @@
             <w:pPr>
               <w:cnfStyle w:val="000000100000" w:firstRow="0" w:lastRow="0" w:firstColumn="0" w:lastColumn="0" w:oddVBand="0" w:evenVBand="0" w:oddHBand="1" w:evenHBand="0" w:firstRowFirstColumn="0" w:firstRowLastColumn="0" w:lastRowFirstColumn="0" w:lastRowLastColumn="0"/>
             </w:pPr>
+            <w:r>
+              <w:t>Domain Testing</w:t>
+            </w:r>
           </w:p>
         </w:tc>
       </w:tr>
@@ -294,7 +300,14 @@
                 <w:rFonts w:ascii="Arial" w:hAnsi="Arial"/>
                 <w:sz w:val="21"/>
               </w:rPr>
-              <w:t>Category ____</w:t>
+              <w:t xml:space="preserve">Category </w:t>
+            </w:r>
+            <w:r>
+              <w:rPr>
+                <w:rFonts w:ascii="Arial" w:hAnsi="Arial"/>
+                <w:sz w:val="21"/>
+              </w:rPr>
+              <w:t>2</w:t>
             </w:r>
           </w:p>
         </w:tc>
@@ -326,6 +339,9 @@
             <w:pPr>
               <w:cnfStyle w:val="000000100000" w:firstRow="0" w:lastRow="0" w:firstColumn="0" w:lastColumn="0" w:oddVBand="0" w:evenVBand="0" w:oddHBand="1" w:evenHBand="0" w:firstRowFirstColumn="0" w:firstRowLastColumn="0" w:lastRowFirstColumn="0" w:lastRowLastColumn="0"/>
             </w:pPr>
+            <w:r>
+              <w:t>27/06/2026</w:t>
+            </w:r>
           </w:p>
         </w:tc>
       </w:tr>
@@ -435,6 +451,12 @@
           <w:rFonts w:ascii="Arial" w:hAnsi="Arial"/>
         </w:rPr>
       </w:pPr>
+      <w:r>
+        <w:rPr>
+          <w:rFonts w:ascii="Arial" w:hAnsi="Arial"/>
+        </w:rPr>
+        <w:t>Claude, Gemini</w:t>
+      </w:r>
     </w:p>
     <w:p>
       <w:pPr>
@@ -455,7 +477,43 @@
           <w:color w:val="707070"/>
           <w:sz w:val="20"/>
         </w:rPr>
-        <w:t>Tick all that apply: [ ] brainstorming  [ ] outlining  [ ] drafting  [ ] feedback  [ ] revision  [ ] coding  [ ] data analysis  [ ] visual design  [ ] other (specify).</w:t>
+        <w:t>Tick all that apply: [</w:t>
+      </w:r>
+      <w:r>
+        <w:rPr>
+          <w:rFonts w:ascii="Arial" w:hAnsi="Arial"/>
+          <w:i/>
+          <w:color w:val="707070"/>
+          <w:sz w:val="20"/>
+        </w:rPr>
+        <w:t>x</w:t>
+      </w:r>
+      <w:r>
+        <w:rPr>
+          <w:rFonts w:ascii="Arial" w:hAnsi="Arial"/>
+          <w:i/>
+          <w:color w:val="707070"/>
+          <w:sz w:val="20"/>
+        </w:rPr>
+        <w:t xml:space="preserve"> ] brainstorming  [</w:t>
+      </w:r>
+      <w:r>
+        <w:rPr>
+          <w:rFonts w:ascii="Arial" w:hAnsi="Arial"/>
+          <w:i/>
+          <w:color w:val="707070"/>
+          <w:sz w:val="20"/>
+        </w:rPr>
+        <w:t>x</w:t>
+      </w:r>
+      <w:r>
+        <w:rPr>
+          <w:rFonts w:ascii="Arial" w:hAnsi="Arial"/>
+          <w:i/>
+          <w:color w:val="707070"/>
+          <w:sz w:val="20"/>
+        </w:rPr>
+        <w:t xml:space="preserve"> ] outlining  [ ] drafting  [ ] feedback  [ ] revision  [ ] coding  [ ] data analysis  [ ] visual design  [ ] other (specify).</w:t>
       </w:r>
     </w:p>
     <w:p>
@@ -491,8 +549,299 @@
       <w:pPr>
         <w:rPr>
           <w:rFonts w:ascii="Arial" w:hAnsi="Arial"/>
+          <w:b/>
+          <w:bCs/>
         </w:rPr>
       </w:pPr>
+      <w:r>
+        <w:rPr>
+          <w:rFonts w:ascii="Arial" w:hAnsi="Arial"/>
+          <w:b/>
+          <w:bCs/>
+        </w:rPr>
+        <w:t>Prompt 1:</w:t>
+      </w:r>
+    </w:p>
+    <w:p>
+      <w:pPr>
+        <w:rPr>
+          <w:rFonts w:ascii="Arial" w:hAnsi="Arial"/>
+        </w:rPr>
+      </w:pPr>
+      <w:r>
+        <w:rPr>
+          <w:rFonts w:ascii="Arial" w:hAnsi="Arial"/>
+        </w:rPr>
+        <w:t>Dựa vào @[README.md]. Viết cho tôi phần test design(Domain task áp dụng phương pháp Equivalance partitioning) của FR03 vào file @[tests/test-design/EP-FR03.md]. Format như sau:</w:t>
+      </w:r>
+    </w:p>
+    <w:p>
+      <w:pPr>
+        <w:numPr>
+          <w:ilvl w:val="0"/>
+          <w:numId w:val="10"/>
+        </w:numPr>
+        <w:rPr>
+          <w:rFonts w:ascii="Arial" w:hAnsi="Arial"/>
+        </w:rPr>
+      </w:pPr>
+      <w:r>
+        <w:rPr>
+          <w:rFonts w:ascii="Arial" w:hAnsi="Arial"/>
+        </w:rPr>
+        <w:lastRenderedPageBreak/>
+        <w:t>Xác định miền giá trị Input &amp; Output Input: Bảng gồm 3 cột: Tên giá trị, số miền giá trị, miền hợp lệ, miền không hợp lệ(liệt kê các miền giá trị đó từng dòng 1) Output: Tương tự như input</w:t>
+      </w:r>
+    </w:p>
+    <w:p>
+      <w:pPr>
+        <w:numPr>
+          <w:ilvl w:val="0"/>
+          <w:numId w:val="10"/>
+        </w:numPr>
+        <w:rPr>
+          <w:rFonts w:ascii="Arial" w:hAnsi="Arial"/>
+        </w:rPr>
+      </w:pPr>
+      <w:r>
+        <w:rPr>
+          <w:rFonts w:ascii="Arial" w:hAnsi="Arial"/>
+        </w:rPr>
+        <w:t>Test case 2.1. Test case cho miền hợp lệ Bảng chứa các test case hợp lệ trong đó phải có các cột sau: ID, Test objective, giá trị input và output.</w:t>
+      </w:r>
+    </w:p>
+    <w:p>
+      <w:pPr>
+        <w:rPr>
+          <w:rFonts w:ascii="Arial" w:hAnsi="Arial"/>
+        </w:rPr>
+      </w:pPr>
+      <w:r>
+        <w:rPr>
+          <w:rFonts w:ascii="Arial" w:hAnsi="Arial"/>
+        </w:rPr>
+        <w:t>2.2. Test case cho miền không hợp lệ Áp dụng tương tự 2.1</w:t>
+      </w:r>
+    </w:p>
+    <w:p>
+      <w:pPr>
+        <w:rPr>
+          <w:rFonts w:ascii="Arial" w:hAnsi="Arial"/>
+        </w:rPr>
+      </w:pPr>
+      <w:r>
+        <w:rPr>
+          <w:rFonts w:ascii="Arial" w:hAnsi="Arial"/>
+        </w:rPr>
+        <w:t>Lưu ý: Đây chỉ là test design, tuyệt đối không được test mà chỉ thiết kế test case thôi.</w:t>
+      </w:r>
+    </w:p>
+    <w:p>
+      <w:pPr>
+        <w:rPr>
+          <w:rFonts w:ascii="Arial" w:hAnsi="Arial"/>
+        </w:rPr>
+      </w:pPr>
+      <w:r>
+        <w:rPr>
+          <w:rFonts w:ascii="Arial" w:hAnsi="Arial"/>
+        </w:rPr>
+        <w:t>ID mẫu của test case hợp lệ là: FR03_EP_V01, FR03_EP_V02 ID mẫu của test case không hợp lệ là: FR03_EP_IV01, FR03_EP_IV02</w:t>
+      </w:r>
+    </w:p>
+    <w:p>
+      <w:pPr>
+        <w:rPr>
+          <w:rFonts w:ascii="Arial" w:hAnsi="Arial"/>
+          <w:b/>
+          <w:bCs/>
+        </w:rPr>
+      </w:pPr>
+      <w:r>
+        <w:rPr>
+          <w:rFonts w:ascii="Arial" w:hAnsi="Arial"/>
+        </w:rPr>
+        <w:t>Test objective thì đại loại là: Test giá trị a trong miền x hoặc test giá trị b trong miền y</w:t>
+      </w:r>
+    </w:p>
+    <w:p>
+      <w:pPr>
+        <w:rPr>
+          <w:rFonts w:ascii="Arial" w:hAnsi="Arial"/>
+        </w:rPr>
+      </w:pPr>
+      <w:r>
+        <w:rPr>
+          <w:rFonts w:ascii="Arial" w:hAnsi="Arial"/>
+          <w:b/>
+          <w:bCs/>
+        </w:rPr>
+        <w:t>Prompt 2:</w:t>
+      </w:r>
+      <w:r>
+        <w:rPr>
+          <w:rFonts w:ascii="Arial" w:hAnsi="Arial"/>
+        </w:rPr>
+        <w:br/>
+      </w:r>
+      <w:r>
+        <w:rPr>
+          <w:rFonts w:ascii="Arial" w:hAnsi="Arial"/>
+        </w:rPr>
+        <w:t>Dựa trên mô tả chức năng FR03 của @[README.md] và các input xác định được trong @[tests/test-design/EP-FR03.md] . Hãy viết cho tôi @[tests/test-design/BVA-FR03.md] áp dụng phương pháp boudary value analysis. Format như sau: Phương pháp: 3-Point Boundary Values (BVA) Yêu cầu tham chiếu: FR-03 (Quên mật khẩu &amp; Đặt lại mật khẩu)</w:t>
+      </w:r>
+    </w:p>
+    <w:p>
+      <w:pPr>
+        <w:numPr>
+          <w:ilvl w:val="0"/>
+          <w:numId w:val="11"/>
+        </w:numPr>
+        <w:rPr>
+          <w:rFonts w:ascii="Arial" w:hAnsi="Arial"/>
+        </w:rPr>
+      </w:pPr>
+      <w:r>
+        <w:rPr>
+          <w:rFonts w:ascii="Arial" w:hAnsi="Arial"/>
+        </w:rPr>
+        <w:t>Xác định input Trình bày bảng chứa các miền giá trị input hợp lệ</w:t>
+      </w:r>
+    </w:p>
+    <w:p>
+      <w:pPr>
+        <w:numPr>
+          <w:ilvl w:val="0"/>
+          <w:numId w:val="11"/>
+        </w:numPr>
+        <w:rPr>
+          <w:rFonts w:ascii="Arial" w:hAnsi="Arial"/>
+        </w:rPr>
+      </w:pPr>
+      <w:r>
+        <w:rPr>
+          <w:rFonts w:ascii="Arial" w:hAnsi="Arial"/>
+        </w:rPr>
+        <w:t>Test case Trình bày bảng với các cột như sau:</w:t>
+      </w:r>
+    </w:p>
+    <w:p>
+      <w:pPr>
+        <w:numPr>
+          <w:ilvl w:val="0"/>
+          <w:numId w:val="12"/>
+        </w:numPr>
+        <w:rPr>
+          <w:rFonts w:ascii="Arial" w:hAnsi="Arial"/>
+        </w:rPr>
+      </w:pPr>
+      <w:r>
+        <w:rPr>
+          <w:rFonts w:ascii="Arial" w:hAnsi="Arial"/>
+        </w:rPr>
+        <w:t>ID: Với mẫu là FR03_[BoundaryType]_[Sequence] BoundaryType sẽ gồm có: MINM, MIN, MINP, MAXM,MAX,MAXP(M là minus(-1), P là Plus(+1))</w:t>
+      </w:r>
+    </w:p>
+    <w:p>
+      <w:pPr>
+        <w:numPr>
+          <w:ilvl w:val="0"/>
+          <w:numId w:val="12"/>
+        </w:numPr>
+        <w:rPr>
+          <w:rFonts w:ascii="Arial" w:hAnsi="Arial"/>
+        </w:rPr>
+      </w:pPr>
+      <w:r>
+        <w:rPr>
+          <w:rFonts w:ascii="Arial" w:hAnsi="Arial"/>
+        </w:rPr>
+        <w:t>Partition Tested</w:t>
+      </w:r>
+    </w:p>
+    <w:p>
+      <w:pPr>
+        <w:numPr>
+          <w:ilvl w:val="0"/>
+          <w:numId w:val="12"/>
+        </w:numPr>
+        <w:rPr>
+          <w:rFonts w:ascii="Arial" w:hAnsi="Arial"/>
+        </w:rPr>
+      </w:pPr>
+      <w:r>
+        <w:rPr>
+          <w:rFonts w:ascii="Arial" w:hAnsi="Arial"/>
+        </w:rPr>
+        <w:t>Các cột input</w:t>
+      </w:r>
+    </w:p>
+    <w:p>
+      <w:pPr>
+        <w:numPr>
+          <w:ilvl w:val="0"/>
+          <w:numId w:val="12"/>
+        </w:numPr>
+        <w:rPr>
+          <w:rFonts w:ascii="Arial" w:hAnsi="Arial"/>
+        </w:rPr>
+      </w:pPr>
+      <w:r>
+        <w:rPr>
+          <w:rFonts w:ascii="Arial" w:hAnsi="Arial"/>
+        </w:rPr>
+        <w:t>Expected Output</w:t>
+      </w:r>
+    </w:p>
+    <w:p>
+      <w:pPr>
+        <w:rPr>
+          <w:rFonts w:ascii="Arial" w:hAnsi="Arial"/>
+        </w:rPr>
+      </w:pPr>
+      <w:r>
+        <w:rPr>
+          <w:rFonts w:ascii="Arial" w:hAnsi="Arial"/>
+        </w:rPr>
+        <w:t>Expected output thì trình bày như bên@[tests/test-design/EP-FR03.md] (mục 3. Rút gọn TC)</w:t>
+      </w:r>
+    </w:p>
+    <w:p>
+      <w:pPr>
+        <w:rPr>
+          <w:rFonts w:ascii="Arial" w:hAnsi="Arial"/>
+        </w:rPr>
+      </w:pPr>
+    </w:p>
+    <w:p>
+      <w:pPr>
+        <w:rPr>
+          <w:rFonts w:ascii="Arial" w:hAnsi="Arial"/>
+          <w:b/>
+          <w:bCs/>
+        </w:rPr>
+      </w:pPr>
+      <w:r>
+        <w:rPr>
+          <w:rFonts w:ascii="Arial" w:hAnsi="Arial"/>
+          <w:b/>
+          <w:bCs/>
+        </w:rPr>
+        <w:t>Prompt 3:</w:t>
+      </w:r>
+    </w:p>
+    <w:p>
+      <w:pPr>
+        <w:rPr>
+          <w:rFonts w:ascii="Arial" w:hAnsi="Arial"/>
+        </w:rPr>
+      </w:pPr>
+      <w:r>
+        <w:rPr>
+          <w:rFonts w:ascii="Arial" w:hAnsi="Arial"/>
+        </w:rPr>
+        <w:t>Viết cho tôi template cho test-design của BVA và EP dựa trên @[tests/test-design/BVA-FR03.md] và @[tests/test-design/EP-FR03.md]. Đặt tên file là BVA_template.md và EP_template.md. BVA_template sẽ, EP_template là template khi design test case.</w:t>
+      </w:r>
     </w:p>
     <w:p>
       <w:pPr>
@@ -531,7 +880,6 @@
         <w:rPr>
           <w:rFonts w:ascii="Arial" w:hAnsi="Arial"/>
         </w:rPr>
-        <w:lastRenderedPageBreak/>
         <w:t>5. How I reviewed, revised, or verified the AI output:</w:t>
       </w:r>
     </w:p>
@@ -544,6 +892,33 @@
           <w:sz w:val="20"/>
         </w:rPr>
         <w:t>Describe your verification method (ran the test, checked the spec, asked the TA, looked up RFC, cross-checked with the ISTQB syllabus, etc.).</w:t>
+      </w:r>
+    </w:p>
+    <w:p>
+      <w:pPr>
+        <w:rPr>
+          <w:rFonts w:ascii="Arial" w:hAnsi="Arial"/>
+        </w:rPr>
+      </w:pPr>
+      <w:r>
+        <w:rPr>
+          <w:rFonts w:ascii="Arial" w:hAnsi="Arial"/>
+        </w:rPr>
+        <w:t xml:space="preserve">I ran the test to check if the actual results were correct. </w:t>
+      </w:r>
+      <w:r>
+        <w:rPr>
+          <w:rFonts w:ascii="Arial" w:hAnsi="Arial"/>
+          <w:lang w:val="en"/>
+        </w:rPr>
+        <w:t>I reviewed the material and checked if the test designs were correct as I had learned them.</w:t>
+      </w:r>
+      <w:r>
+        <w:rPr>
+          <w:rFonts w:ascii="Arial" w:hAnsi="Arial"/>
+          <w:lang w:val="en"/>
+        </w:rPr>
+        <w:t xml:space="preserve"> I check if the bugs actual exist by testing manually</w:t>
       </w:r>
     </w:p>
     <w:p>
@@ -574,6 +949,80 @@
         </w:rPr>
         <w:t>Software Testing uses the IEEE style. Example: Anthropic. (2026). AI Tool (e.g., ChatGPT, Claude, Gemini) [Large language model]. https://claude.ai</w:t>
       </w:r>
+    </w:p>
+    <w:p>
+      <w:pPr>
+        <w:rPr>
+          <w:rFonts w:ascii="Arial" w:hAnsi="Arial"/>
+        </w:rPr>
+      </w:pPr>
+      <w:r>
+        <w:rPr>
+          <w:rFonts w:ascii="Arial" w:hAnsi="Arial"/>
+        </w:rPr>
+        <w:t xml:space="preserve">[1] Google. (2026). Gemini (Version </w:t>
+      </w:r>
+      <w:r>
+        <w:rPr>
+          <w:rFonts w:ascii="Arial" w:hAnsi="Arial"/>
+        </w:rPr>
+        <w:t>3.5 Flash</w:t>
+      </w:r>
+      <w:r>
+        <w:rPr>
+          <w:rFonts w:ascii="Arial" w:hAnsi="Arial"/>
+        </w:rPr>
+        <w:t xml:space="preserve">) [Large language model]. Available: </w:t>
+      </w:r>
+      <w:hyperlink r:id="rId6" w:tgtFrame="_blank" w:history="1">
+        <w:r>
+          <w:rPr>
+            <w:rStyle w:val="Hyperlink"/>
+            <w:rFonts w:ascii="Arial" w:hAnsi="Arial"/>
+          </w:rPr>
+          <w:t>https://gemini.google.com</w:t>
+        </w:r>
+      </w:hyperlink>
+      <w:r>
+        <w:rPr>
+          <w:rFonts w:ascii="Arial" w:hAnsi="Arial"/>
+        </w:rPr>
+        <w:t xml:space="preserve"> </w:t>
+      </w:r>
+    </w:p>
+    <w:p>
+      <w:pPr>
+        <w:rPr>
+          <w:rFonts w:ascii="Arial" w:hAnsi="Arial"/>
+        </w:rPr>
+      </w:pPr>
+      <w:r>
+        <w:rPr>
+          <w:rFonts w:ascii="Arial" w:hAnsi="Arial"/>
+        </w:rPr>
+        <w:t>[2] Anthropic. (2026). Claude (Version</w:t>
+      </w:r>
+      <w:r>
+        <w:rPr>
+          <w:rFonts w:ascii="Arial" w:hAnsi="Arial"/>
+        </w:rPr>
+        <w:t xml:space="preserve"> 4.6 Sonnet</w:t>
+      </w:r>
+      <w:r>
+        <w:rPr>
+          <w:rFonts w:ascii="Arial" w:hAnsi="Arial"/>
+        </w:rPr>
+        <w:t xml:space="preserve">) [Large language model]. Available: </w:t>
+      </w:r>
+      <w:hyperlink r:id="rId7" w:tgtFrame="_blank" w:history="1">
+        <w:r>
+          <w:rPr>
+            <w:rStyle w:val="Hyperlink"/>
+            <w:rFonts w:ascii="Arial" w:hAnsi="Arial"/>
+          </w:rPr>
+          <w:t>https://claude.ai</w:t>
+        </w:r>
+      </w:hyperlink>
     </w:p>
     <w:p>
       <w:pPr>
@@ -840,6 +1289,9 @@
             <w:pPr>
               <w:cnfStyle w:val="000000100000" w:firstRow="0" w:lastRow="0" w:firstColumn="0" w:lastColumn="0" w:oddVBand="0" w:evenVBand="0" w:oddHBand="1" w:evenHBand="0" w:firstRowFirstColumn="0" w:firstRowLastColumn="0" w:lastRowFirstColumn="0" w:lastRowLastColumn="0"/>
             </w:pPr>
+            <w:r>
+              <w:t>27/06/2026</w:t>
+            </w:r>
           </w:p>
         </w:tc>
       </w:tr>
@@ -891,7 +1343,7 @@
                           <pic:cNvPicPr/>
                         </pic:nvPicPr>
                         <pic:blipFill>
-                          <a:blip r:embed="rId6"/>
+                          <a:blip r:embed="rId8"/>
                           <a:stretch>
                             <a:fillRect/>
                           </a:stretch>
@@ -923,6 +1375,7 @@
         <w:rPr>
           <w:rFonts w:ascii="Arial" w:hAnsi="Arial"/>
         </w:rPr>
+        <w:lastRenderedPageBreak/>
         <w:t>References</w:t>
       </w:r>
     </w:p>
@@ -1186,6 +1639,381 @@
       </w:rPr>
     </w:lvl>
   </w:abstractNum>
+  <w:abstractNum w:abstractNumId="9" w15:restartNumberingAfterBreak="0">
+    <w:nsid w:val="105B33BF"/>
+    <w:multiLevelType w:val="multilevel"/>
+    <w:tmpl w:val="C57A8DFA"/>
+    <w:lvl w:ilvl="0">
+      <w:start w:val="1"/>
+      <w:numFmt w:val="decimal"/>
+      <w:lvlText w:val="%1."/>
+      <w:lvlJc w:val="left"/>
+      <w:pPr>
+        <w:tabs>
+          <w:tab w:val="num" w:pos="720"/>
+        </w:tabs>
+        <w:ind w:left="720" w:hanging="360"/>
+      </w:pPr>
+    </w:lvl>
+    <w:lvl w:ilvl="1" w:tentative="1">
+      <w:start w:val="1"/>
+      <w:numFmt w:val="decimal"/>
+      <w:lvlText w:val="%2."/>
+      <w:lvlJc w:val="left"/>
+      <w:pPr>
+        <w:tabs>
+          <w:tab w:val="num" w:pos="1440"/>
+        </w:tabs>
+        <w:ind w:left="1440" w:hanging="360"/>
+      </w:pPr>
+    </w:lvl>
+    <w:lvl w:ilvl="2" w:tentative="1">
+      <w:start w:val="1"/>
+      <w:numFmt w:val="decimal"/>
+      <w:lvlText w:val="%3."/>
+      <w:lvlJc w:val="left"/>
+      <w:pPr>
+        <w:tabs>
+          <w:tab w:val="num" w:pos="2160"/>
+        </w:tabs>
+        <w:ind w:left="2160" w:hanging="360"/>
+      </w:pPr>
+    </w:lvl>
+    <w:lvl w:ilvl="3" w:tentative="1">
+      <w:start w:val="1"/>
+      <w:numFmt w:val="decimal"/>
+      <w:lvlText w:val="%4."/>
+      <w:lvlJc w:val="left"/>
+      <w:pPr>
+        <w:tabs>
+          <w:tab w:val="num" w:pos="2880"/>
+        </w:tabs>
+        <w:ind w:left="2880" w:hanging="360"/>
+      </w:pPr>
+    </w:lvl>
+    <w:lvl w:ilvl="4" w:tentative="1">
+      <w:start w:val="1"/>
+      <w:numFmt w:val="decimal"/>
+      <w:lvlText w:val="%5."/>
+      <w:lvlJc w:val="left"/>
+      <w:pPr>
+        <w:tabs>
+          <w:tab w:val="num" w:pos="3600"/>
+        </w:tabs>
+        <w:ind w:left="3600" w:hanging="360"/>
+      </w:pPr>
+    </w:lvl>
+    <w:lvl w:ilvl="5" w:tentative="1">
+      <w:start w:val="1"/>
+      <w:numFmt w:val="decimal"/>
+      <w:lvlText w:val="%6."/>
+      <w:lvlJc w:val="left"/>
+      <w:pPr>
+        <w:tabs>
+          <w:tab w:val="num" w:pos="4320"/>
+        </w:tabs>
+        <w:ind w:left="4320" w:hanging="360"/>
+      </w:pPr>
+    </w:lvl>
+    <w:lvl w:ilvl="6" w:tentative="1">
+      <w:start w:val="1"/>
+      <w:numFmt w:val="decimal"/>
+      <w:lvlText w:val="%7."/>
+      <w:lvlJc w:val="left"/>
+      <w:pPr>
+        <w:tabs>
+          <w:tab w:val="num" w:pos="5040"/>
+        </w:tabs>
+        <w:ind w:left="5040" w:hanging="360"/>
+      </w:pPr>
+    </w:lvl>
+    <w:lvl w:ilvl="7" w:tentative="1">
+      <w:start w:val="1"/>
+      <w:numFmt w:val="decimal"/>
+      <w:lvlText w:val="%8."/>
+      <w:lvlJc w:val="left"/>
+      <w:pPr>
+        <w:tabs>
+          <w:tab w:val="num" w:pos="5760"/>
+        </w:tabs>
+        <w:ind w:left="5760" w:hanging="360"/>
+      </w:pPr>
+    </w:lvl>
+    <w:lvl w:ilvl="8" w:tentative="1">
+      <w:start w:val="1"/>
+      <w:numFmt w:val="decimal"/>
+      <w:lvlText w:val="%9."/>
+      <w:lvlJc w:val="left"/>
+      <w:pPr>
+        <w:tabs>
+          <w:tab w:val="num" w:pos="6480"/>
+        </w:tabs>
+        <w:ind w:left="6480" w:hanging="360"/>
+      </w:pPr>
+    </w:lvl>
+  </w:abstractNum>
+  <w:abstractNum w:abstractNumId="10" w15:restartNumberingAfterBreak="0">
+    <w:nsid w:val="33992914"/>
+    <w:multiLevelType w:val="multilevel"/>
+    <w:tmpl w:val="20E670D4"/>
+    <w:lvl w:ilvl="0">
+      <w:start w:val="1"/>
+      <w:numFmt w:val="bullet"/>
+      <w:lvlText w:val=""/>
+      <w:lvlJc w:val="left"/>
+      <w:pPr>
+        <w:tabs>
+          <w:tab w:val="num" w:pos="720"/>
+        </w:tabs>
+        <w:ind w:left="720" w:hanging="360"/>
+      </w:pPr>
+      <w:rPr>
+        <w:rFonts w:ascii="Symbol" w:hAnsi="Symbol" w:hint="default"/>
+        <w:sz w:val="20"/>
+      </w:rPr>
+    </w:lvl>
+    <w:lvl w:ilvl="1" w:tentative="1">
+      <w:start w:val="1"/>
+      <w:numFmt w:val="bullet"/>
+      <w:lvlText w:val="o"/>
+      <w:lvlJc w:val="left"/>
+      <w:pPr>
+        <w:tabs>
+          <w:tab w:val="num" w:pos="1440"/>
+        </w:tabs>
+        <w:ind w:left="1440" w:hanging="360"/>
+      </w:pPr>
+      <w:rPr>
+        <w:rFonts w:ascii="Courier New" w:hAnsi="Courier New" w:hint="default"/>
+        <w:sz w:val="20"/>
+      </w:rPr>
+    </w:lvl>
+    <w:lvl w:ilvl="2" w:tentative="1">
+      <w:start w:val="1"/>
+      <w:numFmt w:val="bullet"/>
+      <w:lvlText w:val=""/>
+      <w:lvlJc w:val="left"/>
+      <w:pPr>
+        <w:tabs>
+          <w:tab w:val="num" w:pos="2160"/>
+        </w:tabs>
+        <w:ind w:left="2160" w:hanging="360"/>
+      </w:pPr>
+      <w:rPr>
+        <w:rFonts w:ascii="Wingdings" w:hAnsi="Wingdings" w:hint="default"/>
+        <w:sz w:val="20"/>
+      </w:rPr>
+    </w:lvl>
+    <w:lvl w:ilvl="3" w:tentative="1">
+      <w:start w:val="1"/>
+      <w:numFmt w:val="bullet"/>
+      <w:lvlText w:val=""/>
+      <w:lvlJc w:val="left"/>
+      <w:pPr>
+        <w:tabs>
+          <w:tab w:val="num" w:pos="2880"/>
+        </w:tabs>
+        <w:ind w:left="2880" w:hanging="360"/>
+      </w:pPr>
+      <w:rPr>
+        <w:rFonts w:ascii="Wingdings" w:hAnsi="Wingdings" w:hint="default"/>
+        <w:sz w:val="20"/>
+      </w:rPr>
+    </w:lvl>
+    <w:lvl w:ilvl="4" w:tentative="1">
+      <w:start w:val="1"/>
+      <w:numFmt w:val="bullet"/>
+      <w:lvlText w:val=""/>
+      <w:lvlJc w:val="left"/>
+      <w:pPr>
+        <w:tabs>
+          <w:tab w:val="num" w:pos="3600"/>
+        </w:tabs>
+        <w:ind w:left="3600" w:hanging="360"/>
+      </w:pPr>
+      <w:rPr>
+        <w:rFonts w:ascii="Wingdings" w:hAnsi="Wingdings" w:hint="default"/>
+        <w:sz w:val="20"/>
+      </w:rPr>
+    </w:lvl>
+    <w:lvl w:ilvl="5" w:tentative="1">
+      <w:start w:val="1"/>
+      <w:numFmt w:val="bullet"/>
+      <w:lvlText w:val=""/>
+      <w:lvlJc w:val="left"/>
+      <w:pPr>
+        <w:tabs>
+          <w:tab w:val="num" w:pos="4320"/>
+        </w:tabs>
+        <w:ind w:left="4320" w:hanging="360"/>
+      </w:pPr>
+      <w:rPr>
+        <w:rFonts w:ascii="Wingdings" w:hAnsi="Wingdings" w:hint="default"/>
+        <w:sz w:val="20"/>
+      </w:rPr>
+    </w:lvl>
+    <w:lvl w:ilvl="6" w:tentative="1">
+      <w:start w:val="1"/>
+      <w:numFmt w:val="bullet"/>
+      <w:lvlText w:val=""/>
+      <w:lvlJc w:val="left"/>
+      <w:pPr>
+        <w:tabs>
+          <w:tab w:val="num" w:pos="5040"/>
+        </w:tabs>
+        <w:ind w:left="5040" w:hanging="360"/>
+      </w:pPr>
+      <w:rPr>
+        <w:rFonts w:ascii="Wingdings" w:hAnsi="Wingdings" w:hint="default"/>
+        <w:sz w:val="20"/>
+      </w:rPr>
+    </w:lvl>
+    <w:lvl w:ilvl="7" w:tentative="1">
+      <w:start w:val="1"/>
+      <w:numFmt w:val="bullet"/>
+      <w:lvlText w:val=""/>
+      <w:lvlJc w:val="left"/>
+      <w:pPr>
+        <w:tabs>
+          <w:tab w:val="num" w:pos="5760"/>
+        </w:tabs>
+        <w:ind w:left="5760" w:hanging="360"/>
+      </w:pPr>
+      <w:rPr>
+        <w:rFonts w:ascii="Wingdings" w:hAnsi="Wingdings" w:hint="default"/>
+        <w:sz w:val="20"/>
+      </w:rPr>
+    </w:lvl>
+    <w:lvl w:ilvl="8" w:tentative="1">
+      <w:start w:val="1"/>
+      <w:numFmt w:val="bullet"/>
+      <w:lvlText w:val=""/>
+      <w:lvlJc w:val="left"/>
+      <w:pPr>
+        <w:tabs>
+          <w:tab w:val="num" w:pos="6480"/>
+        </w:tabs>
+        <w:ind w:left="6480" w:hanging="360"/>
+      </w:pPr>
+      <w:rPr>
+        <w:rFonts w:ascii="Wingdings" w:hAnsi="Wingdings" w:hint="default"/>
+        <w:sz w:val="20"/>
+      </w:rPr>
+    </w:lvl>
+  </w:abstractNum>
+  <w:abstractNum w:abstractNumId="11" w15:restartNumberingAfterBreak="0">
+    <w:nsid w:val="7A572C7A"/>
+    <w:multiLevelType w:val="multilevel"/>
+    <w:tmpl w:val="E2600362"/>
+    <w:lvl w:ilvl="0">
+      <w:start w:val="1"/>
+      <w:numFmt w:val="decimal"/>
+      <w:lvlText w:val="%1."/>
+      <w:lvlJc w:val="left"/>
+      <w:pPr>
+        <w:tabs>
+          <w:tab w:val="num" w:pos="720"/>
+        </w:tabs>
+        <w:ind w:left="720" w:hanging="360"/>
+      </w:pPr>
+    </w:lvl>
+    <w:lvl w:ilvl="1" w:tentative="1">
+      <w:start w:val="1"/>
+      <w:numFmt w:val="decimal"/>
+      <w:lvlText w:val="%2."/>
+      <w:lvlJc w:val="left"/>
+      <w:pPr>
+        <w:tabs>
+          <w:tab w:val="num" w:pos="1440"/>
+        </w:tabs>
+        <w:ind w:left="1440" w:hanging="360"/>
+      </w:pPr>
+    </w:lvl>
+    <w:lvl w:ilvl="2" w:tentative="1">
+      <w:start w:val="1"/>
+      <w:numFmt w:val="decimal"/>
+      <w:lvlText w:val="%3."/>
+      <w:lvlJc w:val="left"/>
+      <w:pPr>
+        <w:tabs>
+          <w:tab w:val="num" w:pos="2160"/>
+        </w:tabs>
+        <w:ind w:left="2160" w:hanging="360"/>
+      </w:pPr>
+    </w:lvl>
+    <w:lvl w:ilvl="3" w:tentative="1">
+      <w:start w:val="1"/>
+      <w:numFmt w:val="decimal"/>
+      <w:lvlText w:val="%4."/>
+      <w:lvlJc w:val="left"/>
+      <w:pPr>
+        <w:tabs>
+          <w:tab w:val="num" w:pos="2880"/>
+        </w:tabs>
+        <w:ind w:left="2880" w:hanging="360"/>
+      </w:pPr>
+    </w:lvl>
+    <w:lvl w:ilvl="4" w:tentative="1">
+      <w:start w:val="1"/>
+      <w:numFmt w:val="decimal"/>
+      <w:lvlText w:val="%5."/>
+      <w:lvlJc w:val="left"/>
+      <w:pPr>
+        <w:tabs>
+          <w:tab w:val="num" w:pos="3600"/>
+        </w:tabs>
+        <w:ind w:left="3600" w:hanging="360"/>
+      </w:pPr>
+    </w:lvl>
+    <w:lvl w:ilvl="5" w:tentative="1">
+      <w:start w:val="1"/>
+      <w:numFmt w:val="decimal"/>
+      <w:lvlText w:val="%6."/>
+      <w:lvlJc w:val="left"/>
+      <w:pPr>
+        <w:tabs>
+          <w:tab w:val="num" w:pos="4320"/>
+        </w:tabs>
+        <w:ind w:left="4320" w:hanging="360"/>
+      </w:pPr>
+    </w:lvl>
+    <w:lvl w:ilvl="6" w:tentative="1">
+      <w:start w:val="1"/>
+      <w:numFmt w:val="decimal"/>
+      <w:lvlText w:val="%7."/>
+      <w:lvlJc w:val="left"/>
+      <w:pPr>
+        <w:tabs>
+          <w:tab w:val="num" w:pos="5040"/>
+        </w:tabs>
+        <w:ind w:left="5040" w:hanging="360"/>
+      </w:pPr>
+    </w:lvl>
+    <w:lvl w:ilvl="7" w:tentative="1">
+      <w:start w:val="1"/>
+      <w:numFmt w:val="decimal"/>
+      <w:lvlText w:val="%8."/>
+      <w:lvlJc w:val="left"/>
+      <w:pPr>
+        <w:tabs>
+          <w:tab w:val="num" w:pos="5760"/>
+        </w:tabs>
+        <w:ind w:left="5760" w:hanging="360"/>
+      </w:pPr>
+    </w:lvl>
+    <w:lvl w:ilvl="8" w:tentative="1">
+      <w:start w:val="1"/>
+      <w:numFmt w:val="decimal"/>
+      <w:lvlText w:val="%9."/>
+      <w:lvlJc w:val="left"/>
+      <w:pPr>
+        <w:tabs>
+          <w:tab w:val="num" w:pos="6480"/>
+        </w:tabs>
+        <w:ind w:left="6480" w:hanging="360"/>
+      </w:pPr>
+    </w:lvl>
+  </w:abstractNum>
   <w:num w:numId="1" w16cid:durableId="1415082836">
     <w:abstractNumId w:val="8"/>
   </w:num>
@@ -1212,6 +2040,15 @@
   </w:num>
   <w:num w:numId="9" w16cid:durableId="97064064">
     <w:abstractNumId w:val="0"/>
+  </w:num>
+  <w:num w:numId="10" w16cid:durableId="283705485">
+    <w:abstractNumId w:val="9"/>
+  </w:num>
+  <w:num w:numId="11" w16cid:durableId="2145155124">
+    <w:abstractNumId w:val="11"/>
+  </w:num>
+  <w:num w:numId="12" w16cid:durableId="2066827207">
+    <w:abstractNumId w:val="10"/>
   </w:num>
 </w:numbering>
 </file>

</xml_diff>